<commit_message>
Reframe as personal 1-to-1 emails, not marketing
- Add core principle: emails must look like genuine personal messages
- Plain-text signature only (drop HTML/logo), soft human opt-out line
  instead of formal unsubscribe, no open/click tracking
- AI prompt: personal tone, no sales language, personal short subject
- Update trilingual guide with a 'personal vs marketing' section

Co-Authored-By: Claude Fable 5 <noreply@anthropic.com>
Claude-Session: https://claude.ai/code/session_01Y9bSTtEFpmF6wCBVRRNPYD
</commit_message>
<xml_diff>
--- a/cold-mailer/دليل-الاستخدام-TR-AR-EN.docx
+++ b/cold-mailer/دليل-الاستخدام-TR-AR-EN.docx
@@ -1151,6 +1151,46 @@
           <w:szCs w:val="22"/>
           <w:rtl w:val="false"/>
         </w:rPr>
+        <w:t xml:space="preserve">Satış dili yok ("özel teklif", "sadece şimdi") — bire bir kişisel ton.</w:t>
+      </w:r>
+    </w:p>
+    <w:p>
+      <w:pPr>
+        <w:pStyle w:val="ListParagraph"/>
+        <w:numPr>
+          <w:ilvl w:val="0"/>
+          <w:numId w:val="1"/>
+        </w:numPr>
+        <w:bidi w:val="false"/>
+        <w:spacing w:after="60"/>
+        <w:jc w:val="left"/>
+      </w:pPr>
+      <w:r>
+        <w:rPr>
+          <w:sz w:val="22"/>
+          <w:szCs w:val="22"/>
+          <w:rtl w:val="false"/>
+        </w:rPr>
+        <w:t xml:space="preserve">Takip yok (pixel/link); başarı IMAP’tan gelen yanıtlarla ölçülür.</w:t>
+      </w:r>
+    </w:p>
+    <w:p>
+      <w:pPr>
+        <w:pStyle w:val="ListParagraph"/>
+        <w:numPr>
+          <w:ilvl w:val="0"/>
+          <w:numId w:val="1"/>
+        </w:numPr>
+        <w:bidi w:val="false"/>
+        <w:spacing w:after="60"/>
+        <w:jc w:val="left"/>
+      </w:pPr>
+      <w:r>
+        <w:rPr>
+          <w:sz w:val="22"/>
+          <w:szCs w:val="22"/>
+          <w:rtl w:val="false"/>
+        </w:rPr>
         <w:t xml:space="preserve">Gönderim öncesi otomatik denetim: yasak ifade varsa yeniden yazar.</w:t>
       </w:r>
     </w:p>
@@ -1168,7 +1208,450 @@
           <w:szCs w:val="22"/>
           <w:rtl w:val="false"/>
         </w:rPr>
-        <w:t xml:space="preserve">İmza: Her hesabın kendi imzası signatures.csv dosyasından otomatik eklenir (metin + HTML).</w:t>
+        <w:t xml:space="preserve">İmza: Her hesabın kendi imzası signatures.csv dosyasından otomatik eklenir — sade METİN (ad, unvan, telefon). Logo/HTML yok.</w:t>
+      </w:r>
+    </w:p>
+    <w:p>
+      <w:pPr>
+        <w:spacing w:after="60"/>
+      </w:pPr>
+    </w:p>
+    <w:p>
+      <w:pPr>
+        <w:pStyle w:val="Heading2"/>
+        <w:bidi w:val="false"/>
+        <w:spacing w:after="100" w:before="220"/>
+        <w:jc w:val="left"/>
+      </w:pPr>
+      <w:r>
+        <w:rPr>
+          <w:b/>
+          <w:bCs/>
+          <w:color w:val="1F4E79"/>
+          <w:sz w:val="26"/>
+          <w:szCs w:val="26"/>
+          <w:rtl w:val="false"/>
+        </w:rPr>
+        <w:t xml:space="preserve">⭐ En önemli ilke: Kişisel e-posta, pazarlama değil</w:t>
+      </w:r>
+    </w:p>
+    <w:p>
+      <w:pPr>
+        <w:bidi w:val="false"/>
+        <w:spacing w:after="100"/>
+        <w:jc w:val="left"/>
+      </w:pPr>
+      <w:r>
+        <w:rPr>
+          <w:sz w:val="22"/>
+          <w:szCs w:val="22"/>
+          <w:rtl w:val="false"/>
+        </w:rPr>
+        <w:t xml:space="preserve">Her e-posta, bir kişiye elle yazılmış gerçek bir kişisel mesaj gibi görünmeli — toplu pazarlama gibi değil. Pazarlama görünümlü e-posta (HTML, logo, "abonelikten çık", takip) spam’e düşer; kişisel görünen e-posta gelen kutusuna ulaşır ve yanıt alır.</w:t>
+      </w:r>
+    </w:p>
+    <w:tbl>
+      <w:tblPr>
+        <w:tblW w:type="dxa" w:w="9360"/>
+        <w:tblBorders>
+          <w:top w:val="single" w:color="auto" w:sz="4"/>
+          <w:left w:val="single" w:color="auto" w:sz="4"/>
+          <w:bottom w:val="single" w:color="auto" w:sz="4"/>
+          <w:right w:val="single" w:color="auto" w:sz="4"/>
+          <w:insideH w:val="single" w:color="auto" w:sz="4"/>
+          <w:insideV w:val="single" w:color="auto" w:sz="4"/>
+        </w:tblBorders>
+      </w:tblPr>
+      <w:tblGrid>
+        <w:gridCol w:w="4680"/>
+        <w:gridCol w:w="4680"/>
+      </w:tblGrid>
+      <w:tr>
+        <w:trPr>
+          <w:tblHeader/>
+        </w:trPr>
+        <w:tc>
+          <w:tcPr>
+            <w:tcW w:type="dxa" w:w="4680"/>
+            <w:shd w:fill="1F4E79" w:val="clear"/>
+            <w:tcMar>
+              <w:top w:type="dxa" w:w="60"/>
+              <w:left w:type="dxa" w:w="90"/>
+              <w:bottom w:type="dxa" w:w="60"/>
+              <w:right w:type="dxa" w:w="90"/>
+            </w:tcMar>
+          </w:tcPr>
+          <w:p>
+            <w:pPr>
+              <w:bidi w:val="false"/>
+              <w:jc w:val="left"/>
+            </w:pPr>
+            <w:r>
+              <w:rPr>
+                <w:b/>
+                <w:bCs/>
+                <w:color w:val="FFFFFF"/>
+                <w:sz w:val="20"/>
+                <w:szCs w:val="20"/>
+                <w:rtl w:val="false"/>
+              </w:rPr>
+              <w:t xml:space="preserve">❌ Kaldırıyoruz (pazarlama belirtisi)</w:t>
+            </w:r>
+          </w:p>
+        </w:tc>
+        <w:tc>
+          <w:tcPr>
+            <w:tcW w:type="dxa" w:w="4680"/>
+            <w:shd w:fill="1F4E79" w:val="clear"/>
+            <w:tcMar>
+              <w:top w:type="dxa" w:w="60"/>
+              <w:left w:type="dxa" w:w="90"/>
+              <w:bottom w:type="dxa" w:w="60"/>
+              <w:right w:type="dxa" w:w="90"/>
+            </w:tcMar>
+          </w:tcPr>
+          <w:p>
+            <w:pPr>
+              <w:bidi w:val="false"/>
+              <w:jc w:val="left"/>
+            </w:pPr>
+            <w:r>
+              <w:rPr>
+                <w:b/>
+                <w:bCs/>
+                <w:color w:val="FFFFFF"/>
+                <w:sz w:val="20"/>
+                <w:szCs w:val="20"/>
+                <w:rtl w:val="false"/>
+              </w:rPr>
+              <w:t xml:space="preserve">✅ Kullanıyoruz (kişisel)</w:t>
+            </w:r>
+          </w:p>
+        </w:tc>
+      </w:tr>
+      <w:tr>
+        <w:tc>
+          <w:tcPr>
+            <w:tcW w:type="dxa" w:w="4680"/>
+            <w:tcMar>
+              <w:top w:type="dxa" w:w="60"/>
+              <w:left w:type="dxa" w:w="90"/>
+              <w:bottom w:type="dxa" w:w="60"/>
+              <w:right w:type="dxa" w:w="90"/>
+            </w:tcMar>
+          </w:tcPr>
+          <w:p>
+            <w:pPr>
+              <w:bidi w:val="false"/>
+              <w:jc w:val="left"/>
+            </w:pPr>
+            <w:r>
+              <w:rPr>
+                <w:b w:val="false"/>
+                <w:bCs w:val="false"/>
+                <w:color w:val="000000"/>
+                <w:sz w:val="20"/>
+                <w:szCs w:val="20"/>
+                <w:rtl w:val="false"/>
+              </w:rPr>
+              <w:t xml:space="preserve">HTML imza, logo, renkler</w:t>
+            </w:r>
+          </w:p>
+        </w:tc>
+        <w:tc>
+          <w:tcPr>
+            <w:tcW w:type="dxa" w:w="4680"/>
+            <w:tcMar>
+              <w:top w:type="dxa" w:w="60"/>
+              <w:left w:type="dxa" w:w="90"/>
+              <w:bottom w:type="dxa" w:w="60"/>
+              <w:right w:type="dxa" w:w="90"/>
+            </w:tcMar>
+          </w:tcPr>
+          <w:p>
+            <w:pPr>
+              <w:bidi w:val="false"/>
+              <w:jc w:val="left"/>
+            </w:pPr>
+            <w:r>
+              <w:rPr>
+                <w:b w:val="false"/>
+                <w:bCs w:val="false"/>
+                <w:color w:val="000000"/>
+                <w:sz w:val="20"/>
+                <w:szCs w:val="20"/>
+                <w:rtl w:val="false"/>
+              </w:rPr>
+              <w:t xml:space="preserve">Sade metin imza (ad, unvan, telefon)</w:t>
+            </w:r>
+          </w:p>
+        </w:tc>
+      </w:tr>
+      <w:tr>
+        <w:tc>
+          <w:tcPr>
+            <w:tcW w:type="dxa" w:w="4680"/>
+            <w:shd w:fill="DCE6F1" w:val="clear"/>
+            <w:tcMar>
+              <w:top w:type="dxa" w:w="60"/>
+              <w:left w:type="dxa" w:w="90"/>
+              <w:bottom w:type="dxa" w:w="60"/>
+              <w:right w:type="dxa" w:w="90"/>
+            </w:tcMar>
+          </w:tcPr>
+          <w:p>
+            <w:pPr>
+              <w:bidi w:val="false"/>
+              <w:jc w:val="left"/>
+            </w:pPr>
+            <w:r>
+              <w:rPr>
+                <w:b w:val="false"/>
+                <w:bCs w:val="false"/>
+                <w:color w:val="000000"/>
+                <w:sz w:val="20"/>
+                <w:szCs w:val="20"/>
+                <w:rtl w:val="false"/>
+              </w:rPr>
+              <w:t xml:space="preserve">Resmî "abonelikten çık" linki</w:t>
+            </w:r>
+          </w:p>
+        </w:tc>
+        <w:tc>
+          <w:tcPr>
+            <w:tcW w:type="dxa" w:w="4680"/>
+            <w:shd w:fill="DCE6F1" w:val="clear"/>
+            <w:tcMar>
+              <w:top w:type="dxa" w:w="60"/>
+              <w:left w:type="dxa" w:w="90"/>
+              <w:bottom w:type="dxa" w:w="60"/>
+              <w:right w:type="dxa" w:w="90"/>
+            </w:tcMar>
+          </w:tcPr>
+          <w:p>
+            <w:pPr>
+              <w:bidi w:val="false"/>
+              <w:jc w:val="left"/>
+            </w:pPr>
+            <w:r>
+              <w:rPr>
+                <w:b w:val="false"/>
+                <w:bCs w:val="false"/>
+                <w:color w:val="000000"/>
+                <w:sz w:val="20"/>
+                <w:szCs w:val="20"/>
+                <w:rtl w:val="false"/>
+              </w:rPr>
+              <w:t xml:space="preserve">İnsani cümle: "Uygun değilse söyleyin, rahatsız etmem"</w:t>
+            </w:r>
+          </w:p>
+        </w:tc>
+      </w:tr>
+      <w:tr>
+        <w:tc>
+          <w:tcPr>
+            <w:tcW w:type="dxa" w:w="4680"/>
+            <w:tcMar>
+              <w:top w:type="dxa" w:w="60"/>
+              <w:left w:type="dxa" w:w="90"/>
+              <w:bottom w:type="dxa" w:w="60"/>
+              <w:right w:type="dxa" w:w="90"/>
+            </w:tcMar>
+          </w:tcPr>
+          <w:p>
+            <w:pPr>
+              <w:bidi w:val="false"/>
+              <w:jc w:val="left"/>
+            </w:pPr>
+            <w:r>
+              <w:rPr>
+                <w:b w:val="false"/>
+                <w:bCs w:val="false"/>
+                <w:color w:val="000000"/>
+                <w:sz w:val="20"/>
+                <w:szCs w:val="20"/>
+                <w:rtl w:val="false"/>
+              </w:rPr>
+              <w:t xml:space="preserve">Açılma/tıklama takibi (pixel)</w:t>
+            </w:r>
+          </w:p>
+        </w:tc>
+        <w:tc>
+          <w:tcPr>
+            <w:tcW w:type="dxa" w:w="4680"/>
+            <w:tcMar>
+              <w:top w:type="dxa" w:w="60"/>
+              <w:left w:type="dxa" w:w="90"/>
+              <w:bottom w:type="dxa" w:w="60"/>
+              <w:right w:type="dxa" w:w="90"/>
+            </w:tcMar>
+          </w:tcPr>
+          <w:p>
+            <w:pPr>
+              <w:bidi w:val="false"/>
+              <w:jc w:val="left"/>
+            </w:pPr>
+            <w:r>
+              <w:rPr>
+                <w:b w:val="false"/>
+                <w:bCs w:val="false"/>
+                <w:color w:val="000000"/>
+                <w:sz w:val="20"/>
+                <w:szCs w:val="20"/>
+                <w:rtl w:val="false"/>
+              </w:rPr>
+              <w:t xml:space="preserve">Hiç takip yok</w:t>
+            </w:r>
+          </w:p>
+        </w:tc>
+      </w:tr>
+      <w:tr>
+        <w:tc>
+          <w:tcPr>
+            <w:tcW w:type="dxa" w:w="4680"/>
+            <w:shd w:fill="DCE6F1" w:val="clear"/>
+            <w:tcMar>
+              <w:top w:type="dxa" w:w="60"/>
+              <w:left w:type="dxa" w:w="90"/>
+              <w:bottom w:type="dxa" w:w="60"/>
+              <w:right w:type="dxa" w:w="90"/>
+            </w:tcMar>
+          </w:tcPr>
+          <w:p>
+            <w:pPr>
+              <w:bidi w:val="false"/>
+              <w:jc w:val="left"/>
+            </w:pPr>
+            <w:r>
+              <w:rPr>
+                <w:b w:val="false"/>
+                <w:bCs w:val="false"/>
+                <w:color w:val="000000"/>
+                <w:sz w:val="20"/>
+                <w:szCs w:val="20"/>
+                <w:rtl w:val="false"/>
+              </w:rPr>
+              <w:t xml:space="preserve">Herkese aynı metin</w:t>
+            </w:r>
+          </w:p>
+        </w:tc>
+        <w:tc>
+          <w:tcPr>
+            <w:tcW w:type="dxa" w:w="4680"/>
+            <w:shd w:fill="DCE6F1" w:val="clear"/>
+            <w:tcMar>
+              <w:top w:type="dxa" w:w="60"/>
+              <w:left w:type="dxa" w:w="90"/>
+              <w:bottom w:type="dxa" w:w="60"/>
+              <w:right w:type="dxa" w:w="90"/>
+            </w:tcMar>
+          </w:tcPr>
+          <w:p>
+            <w:pPr>
+              <w:bidi w:val="false"/>
+              <w:jc w:val="left"/>
+            </w:pPr>
+            <w:r>
+              <w:rPr>
+                <w:b w:val="false"/>
+                <w:bCs w:val="false"/>
+                <w:color w:val="000000"/>
+                <w:sz w:val="20"/>
+                <w:szCs w:val="20"/>
+                <w:rtl w:val="false"/>
+              </w:rPr>
+              <w:t xml:space="preserve">Her kişiye gerçekten özel metin</w:t>
+            </w:r>
+          </w:p>
+        </w:tc>
+      </w:tr>
+      <w:tr>
+        <w:tc>
+          <w:tcPr>
+            <w:tcW w:type="dxa" w:w="4680"/>
+            <w:tcMar>
+              <w:top w:type="dxa" w:w="60"/>
+              <w:left w:type="dxa" w:w="90"/>
+              <w:bottom w:type="dxa" w:w="60"/>
+              <w:right w:type="dxa" w:w="90"/>
+            </w:tcMar>
+          </w:tcPr>
+          <w:p>
+            <w:pPr>
+              <w:bidi w:val="false"/>
+              <w:jc w:val="left"/>
+            </w:pPr>
+            <w:r>
+              <w:rPr>
+                <w:b w:val="false"/>
+                <w:bCs w:val="false"/>
+                <w:color w:val="000000"/>
+                <w:sz w:val="20"/>
+                <w:szCs w:val="20"/>
+                <w:rtl w:val="false"/>
+              </w:rPr>
+              <w:t xml:space="preserve">Biçimli HTML, uzun paragraflar</w:t>
+            </w:r>
+          </w:p>
+        </w:tc>
+        <w:tc>
+          <w:tcPr>
+            <w:tcW w:type="dxa" w:w="4680"/>
+            <w:tcMar>
+              <w:top w:type="dxa" w:w="60"/>
+              <w:left w:type="dxa" w:w="90"/>
+              <w:bottom w:type="dxa" w:w="60"/>
+              <w:right w:type="dxa" w:w="90"/>
+            </w:tcMar>
+          </w:tcPr>
+          <w:p>
+            <w:pPr>
+              <w:bidi w:val="false"/>
+              <w:jc w:val="left"/>
+            </w:pPr>
+            <w:r>
+              <w:rPr>
+                <w:b w:val="false"/>
+                <w:bCs w:val="false"/>
+                <w:color w:val="000000"/>
+                <w:sz w:val="20"/>
+                <w:szCs w:val="20"/>
+                <w:rtl w:val="false"/>
+              </w:rPr>
+              <w:t xml:space="preserve">Kısa düz metin (Plain text)</w:t>
+            </w:r>
+          </w:p>
+        </w:tc>
+      </w:tr>
+    </w:tbl>
+    <w:p>
+      <w:pPr>
+        <w:spacing w:after="60"/>
+      </w:pPr>
+    </w:p>
+    <w:p>
+      <w:pPr>
+        <w:pBdr>
+          <w:top w:val="single" w:color="2E7D32" w:sz="2"/>
+          <w:bottom w:val="single" w:color="2E7D32" w:sz="2"/>
+          <w:left w:val="single" w:color="2E7D32" w:sz="12"/>
+          <w:right w:val="single" w:color="2E7D32" w:sz="2"/>
+        </w:pBdr>
+        <w:shd w:fill="FFF3CD" w:val="clear"/>
+        <w:bidi w:val="false"/>
+        <w:spacing w:after="120" w:before="80"/>
+        <w:jc w:val="left"/>
+      </w:pPr>
+      <w:r>
+        <w:rPr>
+          <w:b/>
+          <w:bCs/>
+          <w:color w:val="2E7D32"/>
+          <w:sz w:val="22"/>
+          <w:szCs w:val="22"/>
+          <w:rtl w:val="false"/>
+        </w:rPr>
+        <w:t xml:space="preserve">✅ Görünmez korumalar (ısıtma, SPF/DKIM/DMARC, günlük limit, rastgele gecikme) KALIR — alıcı görmez, sadece ulaşımı korur.</w:t>
       </w:r>
     </w:p>
     <w:p>
@@ -3490,6 +3973,46 @@
           <w:szCs w:val="22"/>
           <w:rtl/>
         </w:rPr>
+        <w:t xml:space="preserve">بلا لغة مبيعات ("عرض خاص"، "الآن فقط") — نبرة شخصية 1-إلى-1.</w:t>
+      </w:r>
+    </w:p>
+    <w:p>
+      <w:pPr>
+        <w:pStyle w:val="ListParagraph"/>
+        <w:numPr>
+          <w:ilvl w:val="0"/>
+          <w:numId w:val="1"/>
+        </w:numPr>
+        <w:bidi/>
+        <w:spacing w:after="60"/>
+        <w:jc w:val="right"/>
+      </w:pPr>
+      <w:r>
+        <w:rPr>
+          <w:sz w:val="22"/>
+          <w:szCs w:val="22"/>
+          <w:rtl/>
+        </w:rPr>
+        <w:t xml:space="preserve">بلا تتبّع (Pixel/روابط)؛ نقيس النجاح بالردود من IMAP لا بالفتح.</w:t>
+      </w:r>
+    </w:p>
+    <w:p>
+      <w:pPr>
+        <w:pStyle w:val="ListParagraph"/>
+        <w:numPr>
+          <w:ilvl w:val="0"/>
+          <w:numId w:val="1"/>
+        </w:numPr>
+        <w:bidi/>
+        <w:spacing w:after="60"/>
+        <w:jc w:val="right"/>
+      </w:pPr>
+      <w:r>
+        <w:rPr>
+          <w:sz w:val="22"/>
+          <w:szCs w:val="22"/>
+          <w:rtl/>
+        </w:rPr>
         <w:t xml:space="preserve">تدقيق تلقائي قبل الإرسال: إن وُجدت عبارة ممنوعة يعيد الكتابة.</w:t>
       </w:r>
     </w:p>
@@ -3507,7 +4030,450 @@
           <w:szCs w:val="22"/>
           <w:rtl/>
         </w:rPr>
-        <w:t xml:space="preserve">التوقيع: توقيع كل حساب يُلصق تلقائياً من ملف signatures.csv (نصي + HTML).</w:t>
+        <w:t xml:space="preserve">التوقيع: توقيع كل حساب يُلصق تلقائياً من ملف signatures.csv — نص بسيط (اسم، منصب، هاتف). بلا شعار أو HTML.</w:t>
+      </w:r>
+    </w:p>
+    <w:p>
+      <w:pPr>
+        <w:spacing w:after="60"/>
+      </w:pPr>
+    </w:p>
+    <w:p>
+      <w:pPr>
+        <w:pStyle w:val="Heading2"/>
+        <w:bidi/>
+        <w:spacing w:after="100" w:before="220"/>
+        <w:jc w:val="right"/>
+      </w:pPr>
+      <w:r>
+        <w:rPr>
+          <w:b/>
+          <w:bCs/>
+          <w:color w:val="1F4E79"/>
+          <w:sz w:val="26"/>
+          <w:szCs w:val="26"/>
+          <w:rtl/>
+        </w:rPr>
+        <w:t xml:space="preserve">⭐ أهم مبدأ: إيميل شخصي لا تسويقي</w:t>
+      </w:r>
+    </w:p>
+    <w:p>
+      <w:pPr>
+        <w:bidi/>
+        <w:spacing w:after="100"/>
+        <w:jc w:val="right"/>
+      </w:pPr>
+      <w:r>
+        <w:rPr>
+          <w:sz w:val="22"/>
+          <w:szCs w:val="22"/>
+          <w:rtl/>
+        </w:rPr>
+        <w:t xml:space="preserve">كل إيميل يجب أن يبدو رسالة شخصية حقيقية كُتبت لشخص واحد — لا حملة جماعية. الإيميل ذو الطابع التسويقي (HTML، شعار، رابط إلغاء اشتراك، تتبّع) يذهب للـ Spam؛ أما الشخصي فيصل للـ Inbox ويُردّ عليه.</w:t>
+      </w:r>
+    </w:p>
+    <w:tbl>
+      <w:tblPr>
+        <w:tblW w:type="dxa" w:w="9360"/>
+        <w:tblBorders>
+          <w:top w:val="single" w:color="auto" w:sz="4"/>
+          <w:left w:val="single" w:color="auto" w:sz="4"/>
+          <w:bottom w:val="single" w:color="auto" w:sz="4"/>
+          <w:right w:val="single" w:color="auto" w:sz="4"/>
+          <w:insideH w:val="single" w:color="auto" w:sz="4"/>
+          <w:insideV w:val="single" w:color="auto" w:sz="4"/>
+        </w:tblBorders>
+      </w:tblPr>
+      <w:tblGrid>
+        <w:gridCol w:w="4680"/>
+        <w:gridCol w:w="4680"/>
+      </w:tblGrid>
+      <w:tr>
+        <w:trPr>
+          <w:tblHeader/>
+        </w:trPr>
+        <w:tc>
+          <w:tcPr>
+            <w:tcW w:type="dxa" w:w="4680"/>
+            <w:shd w:fill="1F4E79" w:val="clear"/>
+            <w:tcMar>
+              <w:top w:type="dxa" w:w="60"/>
+              <w:left w:type="dxa" w:w="90"/>
+              <w:bottom w:type="dxa" w:w="60"/>
+              <w:right w:type="dxa" w:w="90"/>
+            </w:tcMar>
+          </w:tcPr>
+          <w:p>
+            <w:pPr>
+              <w:bidi/>
+              <w:jc w:val="right"/>
+            </w:pPr>
+            <w:r>
+              <w:rPr>
+                <w:b/>
+                <w:bCs/>
+                <w:color w:val="FFFFFF"/>
+                <w:sz w:val="20"/>
+                <w:szCs w:val="20"/>
+                <w:rtl/>
+              </w:rPr>
+              <w:t xml:space="preserve">✅ نعتمده (شخصي)</w:t>
+            </w:r>
+          </w:p>
+        </w:tc>
+        <w:tc>
+          <w:tcPr>
+            <w:tcW w:type="dxa" w:w="4680"/>
+            <w:shd w:fill="1F4E79" w:val="clear"/>
+            <w:tcMar>
+              <w:top w:type="dxa" w:w="60"/>
+              <w:left w:type="dxa" w:w="90"/>
+              <w:bottom w:type="dxa" w:w="60"/>
+              <w:right w:type="dxa" w:w="90"/>
+            </w:tcMar>
+          </w:tcPr>
+          <w:p>
+            <w:pPr>
+              <w:bidi/>
+              <w:jc w:val="right"/>
+            </w:pPr>
+            <w:r>
+              <w:rPr>
+                <w:b/>
+                <w:bCs/>
+                <w:color w:val="FFFFFF"/>
+                <w:sz w:val="20"/>
+                <w:szCs w:val="20"/>
+                <w:rtl/>
+              </w:rPr>
+              <w:t xml:space="preserve">❌ نحذفه (يكشف أنه تسويقي)</w:t>
+            </w:r>
+          </w:p>
+        </w:tc>
+      </w:tr>
+      <w:tr>
+        <w:tc>
+          <w:tcPr>
+            <w:tcW w:type="dxa" w:w="4680"/>
+            <w:tcMar>
+              <w:top w:type="dxa" w:w="60"/>
+              <w:left w:type="dxa" w:w="90"/>
+              <w:bottom w:type="dxa" w:w="60"/>
+              <w:right w:type="dxa" w:w="90"/>
+            </w:tcMar>
+          </w:tcPr>
+          <w:p>
+            <w:pPr>
+              <w:bidi/>
+              <w:jc w:val="right"/>
+            </w:pPr>
+            <w:r>
+              <w:rPr>
+                <w:b w:val="false"/>
+                <w:bCs w:val="false"/>
+                <w:color w:val="000000"/>
+                <w:sz w:val="20"/>
+                <w:szCs w:val="20"/>
+                <w:rtl/>
+              </w:rPr>
+              <w:t xml:space="preserve">توقيع نصي بسيط (اسم، منصب، هاتف)</w:t>
+            </w:r>
+          </w:p>
+        </w:tc>
+        <w:tc>
+          <w:tcPr>
+            <w:tcW w:type="dxa" w:w="4680"/>
+            <w:tcMar>
+              <w:top w:type="dxa" w:w="60"/>
+              <w:left w:type="dxa" w:w="90"/>
+              <w:bottom w:type="dxa" w:w="60"/>
+              <w:right w:type="dxa" w:w="90"/>
+            </w:tcMar>
+          </w:tcPr>
+          <w:p>
+            <w:pPr>
+              <w:bidi/>
+              <w:jc w:val="right"/>
+            </w:pPr>
+            <w:r>
+              <w:rPr>
+                <w:b w:val="false"/>
+                <w:bCs w:val="false"/>
+                <w:color w:val="000000"/>
+                <w:sz w:val="20"/>
+                <w:szCs w:val="20"/>
+                <w:rtl/>
+              </w:rPr>
+              <w:t xml:space="preserve">توقيع HTML، شعار، ألوان</w:t>
+            </w:r>
+          </w:p>
+        </w:tc>
+      </w:tr>
+      <w:tr>
+        <w:tc>
+          <w:tcPr>
+            <w:tcW w:type="dxa" w:w="4680"/>
+            <w:shd w:fill="DCE6F1" w:val="clear"/>
+            <w:tcMar>
+              <w:top w:type="dxa" w:w="60"/>
+              <w:left w:type="dxa" w:w="90"/>
+              <w:bottom w:type="dxa" w:w="60"/>
+              <w:right w:type="dxa" w:w="90"/>
+            </w:tcMar>
+          </w:tcPr>
+          <w:p>
+            <w:pPr>
+              <w:bidi/>
+              <w:jc w:val="right"/>
+            </w:pPr>
+            <w:r>
+              <w:rPr>
+                <w:b w:val="false"/>
+                <w:bCs w:val="false"/>
+                <w:color w:val="000000"/>
+                <w:sz w:val="20"/>
+                <w:szCs w:val="20"/>
+                <w:rtl/>
+              </w:rPr>
+              <w:t xml:space="preserve">جملة إنسانية: «لو ما يناسبك أخبرني وما أزعجك»</w:t>
+            </w:r>
+          </w:p>
+        </w:tc>
+        <w:tc>
+          <w:tcPr>
+            <w:tcW w:type="dxa" w:w="4680"/>
+            <w:shd w:fill="DCE6F1" w:val="clear"/>
+            <w:tcMar>
+              <w:top w:type="dxa" w:w="60"/>
+              <w:left w:type="dxa" w:w="90"/>
+              <w:bottom w:type="dxa" w:w="60"/>
+              <w:right w:type="dxa" w:w="90"/>
+            </w:tcMar>
+          </w:tcPr>
+          <w:p>
+            <w:pPr>
+              <w:bidi/>
+              <w:jc w:val="right"/>
+            </w:pPr>
+            <w:r>
+              <w:rPr>
+                <w:b w:val="false"/>
+                <w:bCs w:val="false"/>
+                <w:color w:val="000000"/>
+                <w:sz w:val="20"/>
+                <w:szCs w:val="20"/>
+                <w:rtl/>
+              </w:rPr>
+              <w:t xml:space="preserve">رابط "إلغاء اشتراك" رسمي</w:t>
+            </w:r>
+          </w:p>
+        </w:tc>
+      </w:tr>
+      <w:tr>
+        <w:tc>
+          <w:tcPr>
+            <w:tcW w:type="dxa" w:w="4680"/>
+            <w:tcMar>
+              <w:top w:type="dxa" w:w="60"/>
+              <w:left w:type="dxa" w:w="90"/>
+              <w:bottom w:type="dxa" w:w="60"/>
+              <w:right w:type="dxa" w:w="90"/>
+            </w:tcMar>
+          </w:tcPr>
+          <w:p>
+            <w:pPr>
+              <w:bidi/>
+              <w:jc w:val="right"/>
+            </w:pPr>
+            <w:r>
+              <w:rPr>
+                <w:b w:val="false"/>
+                <w:bCs w:val="false"/>
+                <w:color w:val="000000"/>
+                <w:sz w:val="20"/>
+                <w:szCs w:val="20"/>
+                <w:rtl/>
+              </w:rPr>
+              <w:t xml:space="preserve">بلا أي تتبّع</w:t>
+            </w:r>
+          </w:p>
+        </w:tc>
+        <w:tc>
+          <w:tcPr>
+            <w:tcW w:type="dxa" w:w="4680"/>
+            <w:tcMar>
+              <w:top w:type="dxa" w:w="60"/>
+              <w:left w:type="dxa" w:w="90"/>
+              <w:bottom w:type="dxa" w:w="60"/>
+              <w:right w:type="dxa" w:w="90"/>
+            </w:tcMar>
+          </w:tcPr>
+          <w:p>
+            <w:pPr>
+              <w:bidi/>
+              <w:jc w:val="right"/>
+            </w:pPr>
+            <w:r>
+              <w:rPr>
+                <w:b w:val="false"/>
+                <w:bCs w:val="false"/>
+                <w:color w:val="000000"/>
+                <w:sz w:val="20"/>
+                <w:szCs w:val="20"/>
+                <w:rtl/>
+              </w:rPr>
+              <w:t xml:space="preserve">تتبّع الفتح/النقر (Pixel)</w:t>
+            </w:r>
+          </w:p>
+        </w:tc>
+      </w:tr>
+      <w:tr>
+        <w:tc>
+          <w:tcPr>
+            <w:tcW w:type="dxa" w:w="4680"/>
+            <w:shd w:fill="DCE6F1" w:val="clear"/>
+            <w:tcMar>
+              <w:top w:type="dxa" w:w="60"/>
+              <w:left w:type="dxa" w:w="90"/>
+              <w:bottom w:type="dxa" w:w="60"/>
+              <w:right w:type="dxa" w:w="90"/>
+            </w:tcMar>
+          </w:tcPr>
+          <w:p>
+            <w:pPr>
+              <w:bidi/>
+              <w:jc w:val="right"/>
+            </w:pPr>
+            <w:r>
+              <w:rPr>
+                <w:b w:val="false"/>
+                <w:bCs w:val="false"/>
+                <w:color w:val="000000"/>
+                <w:sz w:val="20"/>
+                <w:szCs w:val="20"/>
+                <w:rtl/>
+              </w:rPr>
+              <w:t xml:space="preserve">نص فريد فعلاً لكل عميل</w:t>
+            </w:r>
+          </w:p>
+        </w:tc>
+        <w:tc>
+          <w:tcPr>
+            <w:tcW w:type="dxa" w:w="4680"/>
+            <w:shd w:fill="DCE6F1" w:val="clear"/>
+            <w:tcMar>
+              <w:top w:type="dxa" w:w="60"/>
+              <w:left w:type="dxa" w:w="90"/>
+              <w:bottom w:type="dxa" w:w="60"/>
+              <w:right w:type="dxa" w:w="90"/>
+            </w:tcMar>
+          </w:tcPr>
+          <w:p>
+            <w:pPr>
+              <w:bidi/>
+              <w:jc w:val="right"/>
+            </w:pPr>
+            <w:r>
+              <w:rPr>
+                <w:b w:val="false"/>
+                <w:bCs w:val="false"/>
+                <w:color w:val="000000"/>
+                <w:sz w:val="20"/>
+                <w:szCs w:val="20"/>
+                <w:rtl/>
+              </w:rPr>
+              <w:t xml:space="preserve">نص موحّد للجميع</w:t>
+            </w:r>
+          </w:p>
+        </w:tc>
+      </w:tr>
+      <w:tr>
+        <w:tc>
+          <w:tcPr>
+            <w:tcW w:type="dxa" w:w="4680"/>
+            <w:tcMar>
+              <w:top w:type="dxa" w:w="60"/>
+              <w:left w:type="dxa" w:w="90"/>
+              <w:bottom w:type="dxa" w:w="60"/>
+              <w:right w:type="dxa" w:w="90"/>
+            </w:tcMar>
+          </w:tcPr>
+          <w:p>
+            <w:pPr>
+              <w:bidi/>
+              <w:jc w:val="right"/>
+            </w:pPr>
+            <w:r>
+              <w:rPr>
+                <w:b w:val="false"/>
+                <w:bCs w:val="false"/>
+                <w:color w:val="000000"/>
+                <w:sz w:val="20"/>
+                <w:szCs w:val="20"/>
+                <w:rtl/>
+              </w:rPr>
+              <w:t xml:space="preserve">نص عادي قصير (Plain text)</w:t>
+            </w:r>
+          </w:p>
+        </w:tc>
+        <w:tc>
+          <w:tcPr>
+            <w:tcW w:type="dxa" w:w="4680"/>
+            <w:tcMar>
+              <w:top w:type="dxa" w:w="60"/>
+              <w:left w:type="dxa" w:w="90"/>
+              <w:bottom w:type="dxa" w:w="60"/>
+              <w:right w:type="dxa" w:w="90"/>
+            </w:tcMar>
+          </w:tcPr>
+          <w:p>
+            <w:pPr>
+              <w:bidi/>
+              <w:jc w:val="right"/>
+            </w:pPr>
+            <w:r>
+              <w:rPr>
+                <w:b w:val="false"/>
+                <w:bCs w:val="false"/>
+                <w:color w:val="000000"/>
+                <w:sz w:val="20"/>
+                <w:szCs w:val="20"/>
+                <w:rtl/>
+              </w:rPr>
+              <w:t xml:space="preserve">HTML منسّق وفقرات طويلة</w:t>
+            </w:r>
+          </w:p>
+        </w:tc>
+      </w:tr>
+    </w:tbl>
+    <w:p>
+      <w:pPr>
+        <w:spacing w:after="60"/>
+      </w:pPr>
+    </w:p>
+    <w:p>
+      <w:pPr>
+        <w:pBdr>
+          <w:top w:val="single" w:color="2E7D32" w:sz="2"/>
+          <w:bottom w:val="single" w:color="2E7D32" w:sz="2"/>
+          <w:left w:val="single" w:color="2E7D32" w:sz="12"/>
+          <w:right w:val="single" w:color="2E7D32" w:sz="2"/>
+        </w:pBdr>
+        <w:shd w:fill="FFF3CD" w:val="clear"/>
+        <w:bidi/>
+        <w:spacing w:after="120" w:before="80"/>
+        <w:jc w:val="right"/>
+      </w:pPr>
+      <w:r>
+        <w:rPr>
+          <w:b/>
+          <w:bCs/>
+          <w:color w:val="2E7D32"/>
+          <w:sz w:val="22"/>
+          <w:szCs w:val="22"/>
+          <w:rtl/>
+        </w:rPr>
+        <w:t xml:space="preserve">✅ إجراءات الحماية غير المرئية (التسخين، SPF/DKIM/DMARC، الحد اليومي، التأخير العشوائي) تبقى كلها — لا يراها المستلم، وتحمي الوصول فقط.</w:t>
       </w:r>
     </w:p>
     <w:p>
@@ -5829,6 +6795,46 @@
           <w:szCs w:val="22"/>
           <w:rtl w:val="false"/>
         </w:rPr>
+        <w:t xml:space="preserve">No sales language ("special offer", "only now") — a 1-to-1 personal tone.</w:t>
+      </w:r>
+    </w:p>
+    <w:p>
+      <w:pPr>
+        <w:pStyle w:val="ListParagraph"/>
+        <w:numPr>
+          <w:ilvl w:val="0"/>
+          <w:numId w:val="1"/>
+        </w:numPr>
+        <w:bidi w:val="false"/>
+        <w:spacing w:after="60"/>
+        <w:jc w:val="left"/>
+      </w:pPr>
+      <w:r>
+        <w:rPr>
+          <w:sz w:val="22"/>
+          <w:szCs w:val="22"/>
+          <w:rtl w:val="false"/>
+        </w:rPr>
+        <w:t xml:space="preserve">No tracking (pixel/links); success is measured by replies via IMAP, not opens.</w:t>
+      </w:r>
+    </w:p>
+    <w:p>
+      <w:pPr>
+        <w:pStyle w:val="ListParagraph"/>
+        <w:numPr>
+          <w:ilvl w:val="0"/>
+          <w:numId w:val="1"/>
+        </w:numPr>
+        <w:bidi w:val="false"/>
+        <w:spacing w:after="60"/>
+        <w:jc w:val="left"/>
+      </w:pPr>
+      <w:r>
+        <w:rPr>
+          <w:sz w:val="22"/>
+          <w:szCs w:val="22"/>
+          <w:rtl w:val="false"/>
+        </w:rPr>
         <w:t xml:space="preserve">Automatic pre-send check: if a banned phrase appears, it rewrites.</w:t>
       </w:r>
     </w:p>
@@ -5846,7 +6852,450 @@
           <w:szCs w:val="22"/>
           <w:rtl w:val="false"/>
         </w:rPr>
-        <w:t xml:space="preserve">Signature: each account’s signature is appended automatically from signatures.csv (text + HTML).</w:t>
+        <w:t xml:space="preserve">Signature: each account’s signature is appended automatically from signatures.csv — plain TEXT (name, title, phone). No logo/HTML.</w:t>
+      </w:r>
+    </w:p>
+    <w:p>
+      <w:pPr>
+        <w:spacing w:after="60"/>
+      </w:pPr>
+    </w:p>
+    <w:p>
+      <w:pPr>
+        <w:pStyle w:val="Heading2"/>
+        <w:bidi w:val="false"/>
+        <w:spacing w:after="100" w:before="220"/>
+        <w:jc w:val="left"/>
+      </w:pPr>
+      <w:r>
+        <w:rPr>
+          <w:b/>
+          <w:bCs/>
+          <w:color w:val="1F4E79"/>
+          <w:sz w:val="26"/>
+          <w:szCs w:val="26"/>
+          <w:rtl w:val="false"/>
+        </w:rPr>
+        <w:t xml:space="preserve">⭐ The key principle: a personal email, not marketing</w:t>
+      </w:r>
+    </w:p>
+    <w:p>
+      <w:pPr>
+        <w:bidi w:val="false"/>
+        <w:spacing w:after="100"/>
+        <w:jc w:val="left"/>
+      </w:pPr>
+      <w:r>
+        <w:rPr>
+          <w:sz w:val="22"/>
+          <w:szCs w:val="22"/>
+          <w:rtl w:val="false"/>
+        </w:rPr>
+        <w:t xml:space="preserve">Every email must look like a genuine personal message written to one person — not a bulk campaign. A marketing-looking email (HTML, logo, "unsubscribe", tracking) lands in spam; a personal-looking one reaches the inbox and gets replies.</w:t>
+      </w:r>
+    </w:p>
+    <w:tbl>
+      <w:tblPr>
+        <w:tblW w:type="dxa" w:w="9360"/>
+        <w:tblBorders>
+          <w:top w:val="single" w:color="auto" w:sz="4"/>
+          <w:left w:val="single" w:color="auto" w:sz="4"/>
+          <w:bottom w:val="single" w:color="auto" w:sz="4"/>
+          <w:right w:val="single" w:color="auto" w:sz="4"/>
+          <w:insideH w:val="single" w:color="auto" w:sz="4"/>
+          <w:insideV w:val="single" w:color="auto" w:sz="4"/>
+        </w:tblBorders>
+      </w:tblPr>
+      <w:tblGrid>
+        <w:gridCol w:w="4680"/>
+        <w:gridCol w:w="4680"/>
+      </w:tblGrid>
+      <w:tr>
+        <w:trPr>
+          <w:tblHeader/>
+        </w:trPr>
+        <w:tc>
+          <w:tcPr>
+            <w:tcW w:type="dxa" w:w="4680"/>
+            <w:shd w:fill="1F4E79" w:val="clear"/>
+            <w:tcMar>
+              <w:top w:type="dxa" w:w="60"/>
+              <w:left w:type="dxa" w:w="90"/>
+              <w:bottom w:type="dxa" w:w="60"/>
+              <w:right w:type="dxa" w:w="90"/>
+            </w:tcMar>
+          </w:tcPr>
+          <w:p>
+            <w:pPr>
+              <w:bidi w:val="false"/>
+              <w:jc w:val="left"/>
+            </w:pPr>
+            <w:r>
+              <w:rPr>
+                <w:b/>
+                <w:bCs/>
+                <w:color w:val="FFFFFF"/>
+                <w:sz w:val="20"/>
+                <w:szCs w:val="20"/>
+                <w:rtl w:val="false"/>
+              </w:rPr>
+              <w:t xml:space="preserve">❌ We remove (marketing tells)</w:t>
+            </w:r>
+          </w:p>
+        </w:tc>
+        <w:tc>
+          <w:tcPr>
+            <w:tcW w:type="dxa" w:w="4680"/>
+            <w:shd w:fill="1F4E79" w:val="clear"/>
+            <w:tcMar>
+              <w:top w:type="dxa" w:w="60"/>
+              <w:left w:type="dxa" w:w="90"/>
+              <w:bottom w:type="dxa" w:w="60"/>
+              <w:right w:type="dxa" w:w="90"/>
+            </w:tcMar>
+          </w:tcPr>
+          <w:p>
+            <w:pPr>
+              <w:bidi w:val="false"/>
+              <w:jc w:val="left"/>
+            </w:pPr>
+            <w:r>
+              <w:rPr>
+                <w:b/>
+                <w:bCs/>
+                <w:color w:val="FFFFFF"/>
+                <w:sz w:val="20"/>
+                <w:szCs w:val="20"/>
+                <w:rtl w:val="false"/>
+              </w:rPr>
+              <w:t xml:space="preserve">✅ We keep (personal)</w:t>
+            </w:r>
+          </w:p>
+        </w:tc>
+      </w:tr>
+      <w:tr>
+        <w:tc>
+          <w:tcPr>
+            <w:tcW w:type="dxa" w:w="4680"/>
+            <w:tcMar>
+              <w:top w:type="dxa" w:w="60"/>
+              <w:left w:type="dxa" w:w="90"/>
+              <w:bottom w:type="dxa" w:w="60"/>
+              <w:right w:type="dxa" w:w="90"/>
+            </w:tcMar>
+          </w:tcPr>
+          <w:p>
+            <w:pPr>
+              <w:bidi w:val="false"/>
+              <w:jc w:val="left"/>
+            </w:pPr>
+            <w:r>
+              <w:rPr>
+                <w:b w:val="false"/>
+                <w:bCs w:val="false"/>
+                <w:color w:val="000000"/>
+                <w:sz w:val="20"/>
+                <w:szCs w:val="20"/>
+                <w:rtl w:val="false"/>
+              </w:rPr>
+              <w:t xml:space="preserve">HTML signature, logo, colors</w:t>
+            </w:r>
+          </w:p>
+        </w:tc>
+        <w:tc>
+          <w:tcPr>
+            <w:tcW w:type="dxa" w:w="4680"/>
+            <w:tcMar>
+              <w:top w:type="dxa" w:w="60"/>
+              <w:left w:type="dxa" w:w="90"/>
+              <w:bottom w:type="dxa" w:w="60"/>
+              <w:right w:type="dxa" w:w="90"/>
+            </w:tcMar>
+          </w:tcPr>
+          <w:p>
+            <w:pPr>
+              <w:bidi w:val="false"/>
+              <w:jc w:val="left"/>
+            </w:pPr>
+            <w:r>
+              <w:rPr>
+                <w:b w:val="false"/>
+                <w:bCs w:val="false"/>
+                <w:color w:val="000000"/>
+                <w:sz w:val="20"/>
+                <w:szCs w:val="20"/>
+                <w:rtl w:val="false"/>
+              </w:rPr>
+              <w:t xml:space="preserve">Plain-text signature (name, title, phone)</w:t>
+            </w:r>
+          </w:p>
+        </w:tc>
+      </w:tr>
+      <w:tr>
+        <w:tc>
+          <w:tcPr>
+            <w:tcW w:type="dxa" w:w="4680"/>
+            <w:shd w:fill="DCE6F1" w:val="clear"/>
+            <w:tcMar>
+              <w:top w:type="dxa" w:w="60"/>
+              <w:left w:type="dxa" w:w="90"/>
+              <w:bottom w:type="dxa" w:w="60"/>
+              <w:right w:type="dxa" w:w="90"/>
+            </w:tcMar>
+          </w:tcPr>
+          <w:p>
+            <w:pPr>
+              <w:bidi w:val="false"/>
+              <w:jc w:val="left"/>
+            </w:pPr>
+            <w:r>
+              <w:rPr>
+                <w:b w:val="false"/>
+                <w:bCs w:val="false"/>
+                <w:color w:val="000000"/>
+                <w:sz w:val="20"/>
+                <w:szCs w:val="20"/>
+                <w:rtl w:val="false"/>
+              </w:rPr>
+              <w:t xml:space="preserve">Formal "unsubscribe" link</w:t>
+            </w:r>
+          </w:p>
+        </w:tc>
+        <w:tc>
+          <w:tcPr>
+            <w:tcW w:type="dxa" w:w="4680"/>
+            <w:shd w:fill="DCE6F1" w:val="clear"/>
+            <w:tcMar>
+              <w:top w:type="dxa" w:w="60"/>
+              <w:left w:type="dxa" w:w="90"/>
+              <w:bottom w:type="dxa" w:w="60"/>
+              <w:right w:type="dxa" w:w="90"/>
+            </w:tcMar>
+          </w:tcPr>
+          <w:p>
+            <w:pPr>
+              <w:bidi w:val="false"/>
+              <w:jc w:val="left"/>
+            </w:pPr>
+            <w:r>
+              <w:rPr>
+                <w:b w:val="false"/>
+                <w:bCs w:val="false"/>
+                <w:color w:val="000000"/>
+                <w:sz w:val="20"/>
+                <w:szCs w:val="20"/>
+                <w:rtl w:val="false"/>
+              </w:rPr>
+              <w:t xml:space="preserve">Human line: "If it’s not a fit, tell me and I won’t bother you"</w:t>
+            </w:r>
+          </w:p>
+        </w:tc>
+      </w:tr>
+      <w:tr>
+        <w:tc>
+          <w:tcPr>
+            <w:tcW w:type="dxa" w:w="4680"/>
+            <w:tcMar>
+              <w:top w:type="dxa" w:w="60"/>
+              <w:left w:type="dxa" w:w="90"/>
+              <w:bottom w:type="dxa" w:w="60"/>
+              <w:right w:type="dxa" w:w="90"/>
+            </w:tcMar>
+          </w:tcPr>
+          <w:p>
+            <w:pPr>
+              <w:bidi w:val="false"/>
+              <w:jc w:val="left"/>
+            </w:pPr>
+            <w:r>
+              <w:rPr>
+                <w:b w:val="false"/>
+                <w:bCs w:val="false"/>
+                <w:color w:val="000000"/>
+                <w:sz w:val="20"/>
+                <w:szCs w:val="20"/>
+                <w:rtl w:val="false"/>
+              </w:rPr>
+              <w:t xml:space="preserve">Open/click tracking (pixel)</w:t>
+            </w:r>
+          </w:p>
+        </w:tc>
+        <w:tc>
+          <w:tcPr>
+            <w:tcW w:type="dxa" w:w="4680"/>
+            <w:tcMar>
+              <w:top w:type="dxa" w:w="60"/>
+              <w:left w:type="dxa" w:w="90"/>
+              <w:bottom w:type="dxa" w:w="60"/>
+              <w:right w:type="dxa" w:w="90"/>
+            </w:tcMar>
+          </w:tcPr>
+          <w:p>
+            <w:pPr>
+              <w:bidi w:val="false"/>
+              <w:jc w:val="left"/>
+            </w:pPr>
+            <w:r>
+              <w:rPr>
+                <w:b w:val="false"/>
+                <w:bCs w:val="false"/>
+                <w:color w:val="000000"/>
+                <w:sz w:val="20"/>
+                <w:szCs w:val="20"/>
+                <w:rtl w:val="false"/>
+              </w:rPr>
+              <w:t xml:space="preserve">No tracking at all</w:t>
+            </w:r>
+          </w:p>
+        </w:tc>
+      </w:tr>
+      <w:tr>
+        <w:tc>
+          <w:tcPr>
+            <w:tcW w:type="dxa" w:w="4680"/>
+            <w:shd w:fill="DCE6F1" w:val="clear"/>
+            <w:tcMar>
+              <w:top w:type="dxa" w:w="60"/>
+              <w:left w:type="dxa" w:w="90"/>
+              <w:bottom w:type="dxa" w:w="60"/>
+              <w:right w:type="dxa" w:w="90"/>
+            </w:tcMar>
+          </w:tcPr>
+          <w:p>
+            <w:pPr>
+              <w:bidi w:val="false"/>
+              <w:jc w:val="left"/>
+            </w:pPr>
+            <w:r>
+              <w:rPr>
+                <w:b w:val="false"/>
+                <w:bCs w:val="false"/>
+                <w:color w:val="000000"/>
+                <w:sz w:val="20"/>
+                <w:szCs w:val="20"/>
+                <w:rtl w:val="false"/>
+              </w:rPr>
+              <w:t xml:space="preserve">Same text for everyone</w:t>
+            </w:r>
+          </w:p>
+        </w:tc>
+        <w:tc>
+          <w:tcPr>
+            <w:tcW w:type="dxa" w:w="4680"/>
+            <w:shd w:fill="DCE6F1" w:val="clear"/>
+            <w:tcMar>
+              <w:top w:type="dxa" w:w="60"/>
+              <w:left w:type="dxa" w:w="90"/>
+              <w:bottom w:type="dxa" w:w="60"/>
+              <w:right w:type="dxa" w:w="90"/>
+            </w:tcMar>
+          </w:tcPr>
+          <w:p>
+            <w:pPr>
+              <w:bidi w:val="false"/>
+              <w:jc w:val="left"/>
+            </w:pPr>
+            <w:r>
+              <w:rPr>
+                <w:b w:val="false"/>
+                <w:bCs w:val="false"/>
+                <w:color w:val="000000"/>
+                <w:sz w:val="20"/>
+                <w:szCs w:val="20"/>
+                <w:rtl w:val="false"/>
+              </w:rPr>
+              <w:t xml:space="preserve">Truly unique text per contact</w:t>
+            </w:r>
+          </w:p>
+        </w:tc>
+      </w:tr>
+      <w:tr>
+        <w:tc>
+          <w:tcPr>
+            <w:tcW w:type="dxa" w:w="4680"/>
+            <w:tcMar>
+              <w:top w:type="dxa" w:w="60"/>
+              <w:left w:type="dxa" w:w="90"/>
+              <w:bottom w:type="dxa" w:w="60"/>
+              <w:right w:type="dxa" w:w="90"/>
+            </w:tcMar>
+          </w:tcPr>
+          <w:p>
+            <w:pPr>
+              <w:bidi w:val="false"/>
+              <w:jc w:val="left"/>
+            </w:pPr>
+            <w:r>
+              <w:rPr>
+                <w:b w:val="false"/>
+                <w:bCs w:val="false"/>
+                <w:color w:val="000000"/>
+                <w:sz w:val="20"/>
+                <w:szCs w:val="20"/>
+                <w:rtl w:val="false"/>
+              </w:rPr>
+              <w:t xml:space="preserve">Formatted HTML, long paragraphs</w:t>
+            </w:r>
+          </w:p>
+        </w:tc>
+        <w:tc>
+          <w:tcPr>
+            <w:tcW w:type="dxa" w:w="4680"/>
+            <w:tcMar>
+              <w:top w:type="dxa" w:w="60"/>
+              <w:left w:type="dxa" w:w="90"/>
+              <w:bottom w:type="dxa" w:w="60"/>
+              <w:right w:type="dxa" w:w="90"/>
+            </w:tcMar>
+          </w:tcPr>
+          <w:p>
+            <w:pPr>
+              <w:bidi w:val="false"/>
+              <w:jc w:val="left"/>
+            </w:pPr>
+            <w:r>
+              <w:rPr>
+                <w:b w:val="false"/>
+                <w:bCs w:val="false"/>
+                <w:color w:val="000000"/>
+                <w:sz w:val="20"/>
+                <w:szCs w:val="20"/>
+                <w:rtl w:val="false"/>
+              </w:rPr>
+              <w:t xml:space="preserve">Short plain text</w:t>
+            </w:r>
+          </w:p>
+        </w:tc>
+      </w:tr>
+    </w:tbl>
+    <w:p>
+      <w:pPr>
+        <w:spacing w:after="60"/>
+      </w:pPr>
+    </w:p>
+    <w:p>
+      <w:pPr>
+        <w:pBdr>
+          <w:top w:val="single" w:color="2E7D32" w:sz="2"/>
+          <w:bottom w:val="single" w:color="2E7D32" w:sz="2"/>
+          <w:left w:val="single" w:color="2E7D32" w:sz="12"/>
+          <w:right w:val="single" w:color="2E7D32" w:sz="2"/>
+        </w:pBdr>
+        <w:shd w:fill="FFF3CD" w:val="clear"/>
+        <w:bidi w:val="false"/>
+        <w:spacing w:after="120" w:before="80"/>
+        <w:jc w:val="left"/>
+      </w:pPr>
+      <w:r>
+        <w:rPr>
+          <w:b/>
+          <w:bCs/>
+          <w:color w:val="2E7D32"/>
+          <w:sz w:val="22"/>
+          <w:szCs w:val="22"/>
+          <w:rtl w:val="false"/>
+        </w:rPr>
+        <w:t xml:space="preserve">✅ The invisible protections (warmup, SPF/DKIM/DMARC, daily limit, random delay) all stay — the recipient never sees them; they only protect deliverability.</w:t>
       </w:r>
     </w:p>
     <w:p>

</xml_diff>